<commit_message>
vault backup: 2026-10-18 07:33:55
</commit_message>
<xml_diff>
--- a/Visa/801 - Permanent Residency/Prepared Documents/Scott Relationship Statement 801 First Review Draft - WaKr-2631-801-3.docx
+++ b/Visa/801 - Permanent Residency/Prepared Documents/Scott Relationship Statement 801 First Review Draft - WaKr-2631-801-3.docx
@@ -2900,13 +2900,6 @@
 <w:ftr xmlns:wpc="http://schemas.microsoft.com/office/word/2010/wordprocessingCanvas" xmlns:cx="http://schemas.microsoft.com/office/drawing/2014/chartex" xmlns:cx1="http://schemas.microsoft.com/office/drawing/2015/9/8/chartex" xmlns:cx2="http://schemas.microsoft.com/office/drawing/2015/10/21/chartex" xmlns:cx3="http://schemas.microsoft.com/office/drawing/2016/5/9/chartex" xmlns:cx4="http://schemas.microsoft.com/office/drawing/2016/5/10/chartex" xmlns:cx5="http://schemas.microsoft.com/office/drawing/2016/5/11/chartex" xmlns:cx6="http://schemas.microsoft.com/office/drawing/2016/5/12/chartex" xmlns:cx7="http://schemas.microsoft.com/office/drawing/2016/5/13/chartex" xmlns:cx8="http://schemas.microsoft.com/office/drawing/2016/5/14/chartex" xmlns:mc="http://schemas.openxmlformats.org/markup-compatibility/2006" xmlns:aink="http://schemas.microsoft.com/office/drawing/2016/ink" xmlns:am3d="http://schemas.microsoft.com/office/drawing/2017/model3d" xmlns:o="urn:schemas-microsoft-com:office:office" xmlns:oel="http://schemas.microsoft.com/office/2019/extlst" xmlns:r="http://schemas.openxmlformats.org/officeDocument/2006/relationships" xmlns:m="http://schemas.openxmlformats.org/officeDocument/2006/math" xmlns:v="urn:schemas-microsoft-com:vml" xmlns:wp14="http://schemas.microsoft.com/office/word/2010/wordprocessingDrawing" xmlns:wp="http://schemas.openxmlformats.org/drawingml/2006/wordprocessingDrawing" xmlns:w10="urn:schemas-microsoft-com:office:word" xmlns:w="http://schemas.openxmlformats.org/wordprocessingml/2006/main" xmlns:w14="http://schemas.microsoft.com/office/word/2010/wordml" xmlns:w15="http://schemas.microsoft.com/office/word/2012/wordml" xmlns:w16cex="http://schemas.microsoft.com/office/word/2018/wordml/cex" xmlns:w16cid="http://schemas.microsoft.com/office/word/2016/wordml/cid" xmlns:w16="http://schemas.microsoft.com/office/word/2018/wordml" xmlns:w16du="http://schemas.microsoft.com/office/word/2023/wordml/word16du" xmlns:w16sdtdh="http://schemas.microsoft.com/office/word/2020/wordml/sdtdatahash" xmlns:w16sdtfl="http://schemas.microsoft.com/office/word/2024/wordml/sdtformatlock" xmlns:w16se="http://schemas.microsoft.com/office/word/2015/wordml/symex" xmlns:wpg="http://schemas.microsoft.com/office/word/2010/wordprocessingGroup" xmlns:wpi="http://schemas.microsoft.com/office/word/2010/wordprocessingInk" xmlns:wne="http://schemas.microsoft.com/office/word/2006/wordml" xmlns:wps="http://schemas.microsoft.com/office/word/2010/wordprocessingShape" mc:Ignorable="w14 w15 w16se w16cid w16 w16cex w16sdtdh w16sdtfl w16du wp14">
   <w:p>
     <w:pPr>
-      <w:pBdr>
-        <w:top w:val="nil"/>
-        <w:left w:val="nil"/>
-        <w:bottom w:val="nil"/>
-        <w:right w:val="nil"/>
-        <w:between w:val="nil"/>
-      </w:pBdr>
       <w:tabs>
         <w:tab w:val="center" w:pos="4513"/>
         <w:tab w:val="right" w:pos="9026"/>
@@ -2925,13 +2918,6 @@
 <w:ftr xmlns:wpc="http://schemas.microsoft.com/office/word/2010/wordprocessingCanvas" xmlns:cx="http://schemas.microsoft.com/office/drawing/2014/chartex" xmlns:cx1="http://schemas.microsoft.com/office/drawing/2015/9/8/chartex" xmlns:cx2="http://schemas.microsoft.com/office/drawing/2015/10/21/chartex" xmlns:cx3="http://schemas.microsoft.com/office/drawing/2016/5/9/chartex" xmlns:cx4="http://schemas.microsoft.com/office/drawing/2016/5/10/chartex" xmlns:cx5="http://schemas.microsoft.com/office/drawing/2016/5/11/chartex" xmlns:cx6="http://schemas.microsoft.com/office/drawing/2016/5/12/chartex" xmlns:cx7="http://schemas.microsoft.com/office/drawing/2016/5/13/chartex" xmlns:cx8="http://schemas.microsoft.com/office/drawing/2016/5/14/chartex" xmlns:mc="http://schemas.openxmlformats.org/markup-compatibility/2006" xmlns:aink="http://schemas.microsoft.com/office/drawing/2016/ink" xmlns:am3d="http://schemas.microsoft.com/office/drawing/2017/model3d" xmlns:o="urn:schemas-microsoft-com:office:office" xmlns:oel="http://schemas.microsoft.com/office/2019/extlst" xmlns:r="http://schemas.openxmlformats.org/officeDocument/2006/relationships" xmlns:m="http://schemas.openxmlformats.org/officeDocument/2006/math" xmlns:v="urn:schemas-microsoft-com:vml" xmlns:wp14="http://schemas.microsoft.com/office/word/2010/wordprocessingDrawing" xmlns:wp="http://schemas.openxmlformats.org/drawingml/2006/wordprocessingDrawing" xmlns:w10="urn:schemas-microsoft-com:office:word" xmlns:w="http://schemas.openxmlformats.org/wordprocessingml/2006/main" xmlns:w14="http://schemas.microsoft.com/office/word/2010/wordml" xmlns:w15="http://schemas.microsoft.com/office/word/2012/wordml" xmlns:w16cex="http://schemas.microsoft.com/office/word/2018/wordml/cex" xmlns:w16cid="http://schemas.microsoft.com/office/word/2016/wordml/cid" xmlns:w16="http://schemas.microsoft.com/office/word/2018/wordml" xmlns:w16du="http://schemas.microsoft.com/office/word/2023/wordml/word16du" xmlns:w16sdtdh="http://schemas.microsoft.com/office/word/2020/wordml/sdtdatahash" xmlns:w16sdtfl="http://schemas.microsoft.com/office/word/2024/wordml/sdtformatlock" xmlns:w16se="http://schemas.microsoft.com/office/word/2015/wordml/symex" xmlns:wpg="http://schemas.microsoft.com/office/word/2010/wordprocessingGroup" xmlns:wpi="http://schemas.microsoft.com/office/word/2010/wordprocessingInk" xmlns:wne="http://schemas.microsoft.com/office/word/2006/wordml" xmlns:wps="http://schemas.microsoft.com/office/word/2010/wordprocessingShape" mc:Ignorable="w14 w15 w16se w16cid w16 w16cex w16sdtdh w16sdtfl w16du wp14">
   <w:p>
     <w:pPr>
-      <w:pBdr>
-        <w:top w:val="nil"/>
-        <w:left w:val="nil"/>
-        <w:bottom w:val="nil"/>
-        <w:right w:val="nil"/>
-        <w:between w:val="nil"/>
-      </w:pBdr>
       <w:tabs>
         <w:tab w:val="center" w:pos="4513"/>
         <w:tab w:val="right" w:pos="9026"/>
@@ -2950,13 +2936,6 @@
 <w:ftr xmlns:wpc="http://schemas.microsoft.com/office/word/2010/wordprocessingCanvas" xmlns:cx="http://schemas.microsoft.com/office/drawing/2014/chartex" xmlns:cx1="http://schemas.microsoft.com/office/drawing/2015/9/8/chartex" xmlns:cx2="http://schemas.microsoft.com/office/drawing/2015/10/21/chartex" xmlns:cx3="http://schemas.microsoft.com/office/drawing/2016/5/9/chartex" xmlns:cx4="http://schemas.microsoft.com/office/drawing/2016/5/10/chartex" xmlns:cx5="http://schemas.microsoft.com/office/drawing/2016/5/11/chartex" xmlns:cx6="http://schemas.microsoft.com/office/drawing/2016/5/12/chartex" xmlns:cx7="http://schemas.microsoft.com/office/drawing/2016/5/13/chartex" xmlns:cx8="http://schemas.microsoft.com/office/drawing/2016/5/14/chartex" xmlns:mc="http://schemas.openxmlformats.org/markup-compatibility/2006" xmlns:aink="http://schemas.microsoft.com/office/drawing/2016/ink" xmlns:am3d="http://schemas.microsoft.com/office/drawing/2017/model3d" xmlns:o="urn:schemas-microsoft-com:office:office" xmlns:oel="http://schemas.microsoft.com/office/2019/extlst" xmlns:r="http://schemas.openxmlformats.org/officeDocument/2006/relationships" xmlns:m="http://schemas.openxmlformats.org/officeDocument/2006/math" xmlns:v="urn:schemas-microsoft-com:vml" xmlns:wp14="http://schemas.microsoft.com/office/word/2010/wordprocessingDrawing" xmlns:wp="http://schemas.openxmlformats.org/drawingml/2006/wordprocessingDrawing" xmlns:w10="urn:schemas-microsoft-com:office:word" xmlns:w="http://schemas.openxmlformats.org/wordprocessingml/2006/main" xmlns:w14="http://schemas.microsoft.com/office/word/2010/wordml" xmlns:w15="http://schemas.microsoft.com/office/word/2012/wordml" xmlns:w16cex="http://schemas.microsoft.com/office/word/2018/wordml/cex" xmlns:w16cid="http://schemas.microsoft.com/office/word/2016/wordml/cid" xmlns:w16="http://schemas.microsoft.com/office/word/2018/wordml" xmlns:w16du="http://schemas.microsoft.com/office/word/2023/wordml/word16du" xmlns:w16sdtdh="http://schemas.microsoft.com/office/word/2020/wordml/sdtdatahash" xmlns:w16sdtfl="http://schemas.microsoft.com/office/word/2024/wordml/sdtformatlock" xmlns:w16se="http://schemas.microsoft.com/office/word/2015/wordml/symex" xmlns:wpg="http://schemas.microsoft.com/office/word/2010/wordprocessingGroup" xmlns:wpi="http://schemas.microsoft.com/office/word/2010/wordprocessingInk" xmlns:wne="http://schemas.microsoft.com/office/word/2006/wordml" xmlns:wps="http://schemas.microsoft.com/office/word/2010/wordprocessingShape" mc:Ignorable="w14 w15 w16se w16cid w16 w16cex w16sdtdh w16sdtfl w16du wp14">
   <w:p>
     <w:pPr>
-      <w:pBdr>
-        <w:top w:val="nil"/>
-        <w:left w:val="nil"/>
-        <w:bottom w:val="nil"/>
-        <w:right w:val="nil"/>
-        <w:between w:val="nil"/>
-      </w:pBdr>
       <w:tabs>
         <w:tab w:val="center" w:pos="4513"/>
         <w:tab w:val="right" w:pos="9026"/>
@@ -3002,13 +2981,6 @@
 <w:hdr xmlns:wpc="http://schemas.microsoft.com/office/word/2010/wordprocessingCanvas" xmlns:cx="http://schemas.microsoft.com/office/drawing/2014/chartex" xmlns:cx1="http://schemas.microsoft.com/office/drawing/2015/9/8/chartex" xmlns:cx2="http://schemas.microsoft.com/office/drawing/2015/10/21/chartex" xmlns:cx3="http://schemas.microsoft.com/office/drawing/2016/5/9/chartex" xmlns:cx4="http://schemas.microsoft.com/office/drawing/2016/5/10/chartex" xmlns:cx5="http://schemas.microsoft.com/office/drawing/2016/5/11/chartex" xmlns:cx6="http://schemas.microsoft.com/office/drawing/2016/5/12/chartex" xmlns:cx7="http://schemas.microsoft.com/office/drawing/2016/5/13/chartex" xmlns:cx8="http://schemas.microsoft.com/office/drawing/2016/5/14/chartex" xmlns:mc="http://schemas.openxmlformats.org/markup-compatibility/2006" xmlns:aink="http://schemas.microsoft.com/office/drawing/2016/ink" xmlns:am3d="http://schemas.microsoft.com/office/drawing/2017/model3d" xmlns:o="urn:schemas-microsoft-com:office:office" xmlns:oel="http://schemas.microsoft.com/office/2019/extlst" xmlns:r="http://schemas.openxmlformats.org/officeDocument/2006/relationships" xmlns:m="http://schemas.openxmlformats.org/officeDocument/2006/math" xmlns:v="urn:schemas-microsoft-com:vml" xmlns:wp14="http://schemas.microsoft.com/office/word/2010/wordprocessingDrawing" xmlns:wp="http://schemas.openxmlformats.org/drawingml/2006/wordprocessingDrawing" xmlns:w10="urn:schemas-microsoft-com:office:word" xmlns:w="http://schemas.openxmlformats.org/wordprocessingml/2006/main" xmlns:w14="http://schemas.microsoft.com/office/word/2010/wordml" xmlns:w15="http://schemas.microsoft.com/office/word/2012/wordml" xmlns:w16cex="http://schemas.microsoft.com/office/word/2018/wordml/cex" xmlns:w16cid="http://schemas.microsoft.com/office/word/2016/wordml/cid" xmlns:w16="http://schemas.microsoft.com/office/word/2018/wordml" xmlns:w16du="http://schemas.microsoft.com/office/word/2023/wordml/word16du" xmlns:w16sdtdh="http://schemas.microsoft.com/office/word/2020/wordml/sdtdatahash" xmlns:w16sdtfl="http://schemas.microsoft.com/office/word/2024/wordml/sdtformatlock" xmlns:w16se="http://schemas.microsoft.com/office/word/2015/wordml/symex" xmlns:wpg="http://schemas.microsoft.com/office/word/2010/wordprocessingGroup" xmlns:wpi="http://schemas.microsoft.com/office/word/2010/wordprocessingInk" xmlns:wne="http://schemas.microsoft.com/office/word/2006/wordml" xmlns:wps="http://schemas.microsoft.com/office/word/2010/wordprocessingShape" mc:Ignorable="w14 w15 w16se w16cid w16 w16cex w16sdtdh w16sdtfl w16du wp14">
   <w:p>
     <w:pPr>
-      <w:pBdr>
-        <w:top w:val="nil"/>
-        <w:left w:val="nil"/>
-        <w:bottom w:val="nil"/>
-        <w:right w:val="nil"/>
-        <w:between w:val="nil"/>
-      </w:pBdr>
       <w:tabs>
         <w:tab w:val="center" w:pos="4513"/>
         <w:tab w:val="right" w:pos="9026"/>
@@ -3027,13 +2999,6 @@
 <w:hdr xmlns:wpc="http://schemas.microsoft.com/office/word/2010/wordprocessingCanvas" xmlns:cx="http://schemas.microsoft.com/office/drawing/2014/chartex" xmlns:cx1="http://schemas.microsoft.com/office/drawing/2015/9/8/chartex" xmlns:cx2="http://schemas.microsoft.com/office/drawing/2015/10/21/chartex" xmlns:cx3="http://schemas.microsoft.com/office/drawing/2016/5/9/chartex" xmlns:cx4="http://schemas.microsoft.com/office/drawing/2016/5/10/chartex" xmlns:cx5="http://schemas.microsoft.com/office/drawing/2016/5/11/chartex" xmlns:cx6="http://schemas.microsoft.com/office/drawing/2016/5/12/chartex" xmlns:cx7="http://schemas.microsoft.com/office/drawing/2016/5/13/chartex" xmlns:cx8="http://schemas.microsoft.com/office/drawing/2016/5/14/chartex" xmlns:mc="http://schemas.openxmlformats.org/markup-compatibility/2006" xmlns:aink="http://schemas.microsoft.com/office/drawing/2016/ink" xmlns:am3d="http://schemas.microsoft.com/office/drawing/2017/model3d" xmlns:o="urn:schemas-microsoft-com:office:office" xmlns:oel="http://schemas.microsoft.com/office/2019/extlst" xmlns:r="http://schemas.openxmlformats.org/officeDocument/2006/relationships" xmlns:m="http://schemas.openxmlformats.org/officeDocument/2006/math" xmlns:v="urn:schemas-microsoft-com:vml" xmlns:wp14="http://schemas.microsoft.com/office/word/2010/wordprocessingDrawing" xmlns:wp="http://schemas.openxmlformats.org/drawingml/2006/wordprocessingDrawing" xmlns:w10="urn:schemas-microsoft-com:office:word" xmlns:w="http://schemas.openxmlformats.org/wordprocessingml/2006/main" xmlns:w14="http://schemas.microsoft.com/office/word/2010/wordml" xmlns:w15="http://schemas.microsoft.com/office/word/2012/wordml" xmlns:w16cex="http://schemas.microsoft.com/office/word/2018/wordml/cex" xmlns:w16cid="http://schemas.microsoft.com/office/word/2016/wordml/cid" xmlns:w16="http://schemas.microsoft.com/office/word/2018/wordml" xmlns:w16du="http://schemas.microsoft.com/office/word/2023/wordml/word16du" xmlns:w16sdtdh="http://schemas.microsoft.com/office/word/2020/wordml/sdtdatahash" xmlns:w16sdtfl="http://schemas.microsoft.com/office/word/2024/wordml/sdtformatlock" xmlns:w16se="http://schemas.microsoft.com/office/word/2015/wordml/symex" xmlns:wpg="http://schemas.microsoft.com/office/word/2010/wordprocessingGroup" xmlns:wpi="http://schemas.microsoft.com/office/word/2010/wordprocessingInk" xmlns:wne="http://schemas.microsoft.com/office/word/2006/wordml" xmlns:wps="http://schemas.microsoft.com/office/word/2010/wordprocessingShape" mc:Ignorable="w14 w15 w16se w16cid w16 w16cex w16sdtdh w16sdtfl w16du wp14">
   <w:p>
     <w:pPr>
-      <w:pBdr>
-        <w:top w:val="nil"/>
-        <w:left w:val="nil"/>
-        <w:bottom w:val="nil"/>
-        <w:right w:val="nil"/>
-        <w:between w:val="nil"/>
-      </w:pBdr>
       <w:tabs>
         <w:tab w:val="center" w:pos="4513"/>
         <w:tab w:val="right" w:pos="9026"/>
@@ -3052,13 +3017,6 @@
 <w:hdr xmlns:wpc="http://schemas.microsoft.com/office/word/2010/wordprocessingCanvas" xmlns:cx="http://schemas.microsoft.com/office/drawing/2014/chartex" xmlns:cx1="http://schemas.microsoft.com/office/drawing/2015/9/8/chartex" xmlns:cx2="http://schemas.microsoft.com/office/drawing/2015/10/21/chartex" xmlns:cx3="http://schemas.microsoft.com/office/drawing/2016/5/9/chartex" xmlns:cx4="http://schemas.microsoft.com/office/drawing/2016/5/10/chartex" xmlns:cx5="http://schemas.microsoft.com/office/drawing/2016/5/11/chartex" xmlns:cx6="http://schemas.microsoft.com/office/drawing/2016/5/12/chartex" xmlns:cx7="http://schemas.microsoft.com/office/drawing/2016/5/13/chartex" xmlns:cx8="http://schemas.microsoft.com/office/drawing/2016/5/14/chartex" xmlns:mc="http://schemas.openxmlformats.org/markup-compatibility/2006" xmlns:aink="http://schemas.microsoft.com/office/drawing/2016/ink" xmlns:am3d="http://schemas.microsoft.com/office/drawing/2017/model3d" xmlns:o="urn:schemas-microsoft-com:office:office" xmlns:oel="http://schemas.microsoft.com/office/2019/extlst" xmlns:r="http://schemas.openxmlformats.org/officeDocument/2006/relationships" xmlns:m="http://schemas.openxmlformats.org/officeDocument/2006/math" xmlns:v="urn:schemas-microsoft-com:vml" xmlns:wp14="http://schemas.microsoft.com/office/word/2010/wordprocessingDrawing" xmlns:wp="http://schemas.openxmlformats.org/drawingml/2006/wordprocessingDrawing" xmlns:w10="urn:schemas-microsoft-com:office:word" xmlns:w="http://schemas.openxmlformats.org/wordprocessingml/2006/main" xmlns:w14="http://schemas.microsoft.com/office/word/2010/wordml" xmlns:w15="http://schemas.microsoft.com/office/word/2012/wordml" xmlns:w16cex="http://schemas.microsoft.com/office/word/2018/wordml/cex" xmlns:w16cid="http://schemas.microsoft.com/office/word/2016/wordml/cid" xmlns:w16="http://schemas.microsoft.com/office/word/2018/wordml" xmlns:w16du="http://schemas.microsoft.com/office/word/2023/wordml/word16du" xmlns:w16sdtdh="http://schemas.microsoft.com/office/word/2020/wordml/sdtdatahash" xmlns:w16sdtfl="http://schemas.microsoft.com/office/word/2024/wordml/sdtformatlock" xmlns:w16se="http://schemas.microsoft.com/office/word/2015/wordml/symex" xmlns:wpg="http://schemas.microsoft.com/office/word/2010/wordprocessingGroup" xmlns:wpi="http://schemas.microsoft.com/office/word/2010/wordprocessingInk" xmlns:wne="http://schemas.microsoft.com/office/word/2006/wordml" xmlns:wps="http://schemas.microsoft.com/office/word/2010/wordprocessingShape" mc:Ignorable="w14 w15 w16se w16cid w16 w16cex w16sdtdh w16sdtfl w16du wp14">
   <w:p>
     <w:pPr>
-      <w:pBdr>
-        <w:top w:val="nil"/>
-        <w:left w:val="nil"/>
-        <w:bottom w:val="nil"/>
-        <w:right w:val="nil"/>
-        <w:between w:val="nil"/>
-      </w:pBdr>
       <w:tabs>
         <w:tab w:val="center" w:pos="4513"/>
         <w:tab w:val="right" w:pos="9026"/>

</xml_diff>

<commit_message>
vault backup: 2026-10-18 09:39:26
</commit_message>
<xml_diff>
--- a/Visa/801 - Permanent Residency/Prepared Documents/Scott Relationship Statement 801 First Review Draft - WaKr-2631-801-3.docx
+++ b/Visa/801 - Permanent Residency/Prepared Documents/Scott Relationship Statement 801 First Review Draft - WaKr-2631-801-3.docx
@@ -133,7 +133,7 @@
                 <w:rFonts w:ascii="Arial" w:hAnsi="Arial"/>
                 <w:sz w:val="18"/>
               </w:rPr>
-              <w:t>I, 1 Scott Phillip Warren, 8/4 Prince Street, Coffs Harbour, NSW 2450, Web Developer,</w:t>
+              <w:t>I, 1 Scott Phillip Warren, 8/4 Prince Street, Coffs Harbour, NSW 2450, Software Engineer,</w:t>
             </w:r>
           </w:p>
           <w:p>
@@ -266,7 +266,7 @@
                 <w:rFonts w:ascii="Arial" w:hAnsi="Arial"/>
                 <w:sz w:val="17"/>
               </w:rPr>
-              <w:t>1. I am Scott Phillip Warren, and I make this statement in support of my wife Kristina Aleksandrova Warren's application for the permanent Partner visa. We married in Bulgaria on 10 July 2023. This statement updates our life together since her Subclass 820 visa was granted on 24 September 2025.</w:t>
+              <w:t>1. I am Scott Phillip Warren, and I make this statement in support of my wife Kristina Aleksandrova Warren's application for the permanent Partner visa. Our relationship began in December 2017, and we have lived together since 20 December 2017, apart from temporary periods of travel. We married in Bulgaria on 10 July 2023. Our earlier relationship history was provided with the temporary Partner visa application. This statement focuses on how our genuine and continuing relationship has developed since Kristina's Subclass 820 visa was granted on 24 September 2025.</w:t>
             </w:r>
           </w:p>
           <w:p>
@@ -278,7 +278,7 @@
                 <w:rFonts w:ascii="Arial" w:hAnsi="Arial"/>
                 <w:sz w:val="17"/>
               </w:rPr>
-              <w:t>2. We have continued to live together and build our life in Australia. We arrived in June 2024 and initially stayed with my mum, then with my sister after our dog arrived from Bulgaria. We moved to Urunga under a joint lease commencing on 11 November 2024 so that Kristina could study Exhibited Animal Care at TAFE in Coffs Harbour. We chose the Coffs Harbour area after considering courses in Cairns and Coffs Harbour because it was closer to my family.</w:t>
+              <w:t>2. We have continued to live together and build our life in Australia. We arrived in June 2024 and initially stayed with my mum for approximately two months, then with my sister for approximately two months after our dog arrived from Bulgaria. We decided to move to the Coffs Harbour area so that Kristina could study Exhibited Animal Care at TAFE. We had considered course options in Cairns and Coffs Harbour and chose Coffs Harbour because it was closer to my family.</w:t>
             </w:r>
           </w:p>
           <w:p>
@@ -290,7 +290,7 @@
                 <w:rFonts w:ascii="Arial" w:hAnsi="Arial"/>
                 <w:sz w:val="17"/>
               </w:rPr>
-              <w:t>3. Finding our first rental was difficult because we had no recent Australian rental history together and I had only recently started a new job. We were excited to have our own home after about four months with family. When we later found a rental in Coffs Harbour itself, I was unwell and Kristina inspected the property and managed the arrangements. We agreed on the move together and hired movers.</w:t>
+              <w:t>3. Our joint lease at 28 Fitzroy Street, Urunga commenced on 11 November 2024. After the fixed term ended, the tenancy continued periodically until we moved to Coffs Harbour in July 2025. We lived there together with our dog and no other household members. Finding that rental was difficult because we had no recent Australian rental history together and I had only recently started a new job. We were excited to have our own home after approximately four months with family. When we later found a rental in Coffs Harbour itself, I was unwell, so Kristina inspected the property and managed the arrangements. We agreed on the move together and hired movers.</w:t>
             </w:r>
           </w:p>
           <w:p>
@@ -328,7 +328,7 @@
                 <w:rFonts w:ascii="Arial" w:hAnsi="Arial"/>
                 <w:sz w:val="17"/>
               </w:rPr>
-              <w:t>5. I began my current remote job in October 2024 and remain in that role. I was the sole income earner while Kristina studied. She completed Certificate II in Exhibited Animal Care in June 2025 and Certificate III in Exhibited Animal Care in June 2026. She has now started contract work at Coffs Coast Wildlife Sanctuary, with her first shifts around the beginning of October 2026.</w:t>
+              <w:t>5. I began working remotely as a Software Engineer for Atlassian on 21 October 2024 and remain in that role. I was the sole income earner while Kristina studied. She completed Certificate II in Exhibited Animal Care in June 2025 and Certificate III in Exhibited Animal Care in June 2026. She has now started contract work at Coffs Coast Wildlife Sanctuary, with her first shift on 1 October 2026.</w:t>
             </w:r>
           </w:p>
           <w:p>
@@ -376,7 +376,7 @@
                 <w:rFonts w:ascii="Arial" w:hAnsi="Arial"/>
                 <w:sz w:val="17"/>
               </w:rPr>
-              <w:t>9. We also jointly decided to borrow money for specialist surgery when our dog developed serious knee problems in 2026. These decisions affected both of us and were made together. I have nominated Kristina as the 100% beneficiary of my IOOF superannuation death benefit under a binding non-lapsing nomination. Kristina has also told me that she has nominated me as her superannuation beneficiary.</w:t>
+              <w:t>9. When our dog developed serious knee problems in 2026, we paid for his first two surgeries from our joint savings. When his most recent operation required specialist treatment, we jointly decided to take out a loan to pay for it. These were significant financial decisions that affected both of us and were made together. I have nominated Kristina as the 100% beneficiary of my IOOF superannuation death benefit under a binding non-lapsing nomination. I have personally seen that Kristina has nominated me as a beneficiary through her AustralianSuper account.</w:t>
             </w:r>
           </w:p>
           <w:p>
@@ -514,7 +514,7 @@
                 <w:rFonts w:ascii="Arial" w:hAnsi="Arial"/>
                 <w:sz w:val="17"/>
               </w:rPr>
-              <w:t>17. Since the beginning of 2026, our dog has required several major knee surgeries. The most recent operation required a specialist and a loan to pay for the treatment. We made that decision together and have shared his care throughout the stressful recovery periods.</w:t>
+              <w:t>17. Since the beginning of 2026, our dog has required three major knee surgeries. We paid for the first two surgeries from our joint savings. The most recent operation required specialist treatment, so we jointly decided to take out a loan to pay for it. We have shared his care throughout the stressful recovery periods.</w:t>
             </w:r>
           </w:p>
           <w:p>
@@ -588,7 +588,7 @@
                 <w:rFonts w:ascii="Arial" w:hAnsi="Arial"/>
                 <w:sz w:val="17"/>
               </w:rPr>
-              <w:t>22. Kristina travelled to Bali with her best friend from 30 September to 10 October 2025, while I remained in Australia. We messaged every day and, as I recall, spoke on FaceTime most nights. It was the longest we had been apart for several years, and neither of us enjoyed the separation.</w:t>
+              <w:t>22. Kristina travelled to Bali with her best friend from 30 September to 10 October 2025, while I remained in Australia. We remained in regular contact through messages on most days and video calls when her schedule allowed. It was the longest we had been apart for several years, and neither of us enjoyed the separation.</w:t>
             </w:r>
           </w:p>
           <w:p>

</xml_diff>

<commit_message>
vault backup: 2026-10-18 09:48:18
</commit_message>
<xml_diff>
--- a/Visa/801 - Permanent Residency/Prepared Documents/Scott Relationship Statement 801 First Review Draft - WaKr-2631-801-3.docx
+++ b/Visa/801 - Permanent Residency/Prepared Documents/Scott Relationship Statement 801 First Review Draft - WaKr-2631-801-3.docx
@@ -464,7 +464,7 @@
                 <w:rFonts w:ascii="Arial" w:hAnsi="Arial"/>
                 <w:sz w:val="17"/>
               </w:rPr>
-              <w:t>14. We eat together and often watch television together. We recently finished Peaky Blinders. We watched the first season of The White Lotus during a long flight and recently started the second season. Kristina also volunteers with WIRES and sometimes spends weekends helping animals.</w:t>
+              <w:t>14. Since moving to Coffs Harbour, Kristina has developed a strong local group of friends. In January 2026 we spent time with one of her friends and her friend's husband. In February 2026 we travelled to Sydney together to attend the Bad Bunny concert, and in August 2026 we went whale watching with some of Kristina's friends. Most of my friends and family live elsewhere, but our relationships with my side of the family have grown closer. Because of the distance, we mostly stay in contact with them by telephone and video calls. Kristina also volunteers with WIRES and sometimes spends weekends helping animals.</w:t>
             </w:r>
           </w:p>
           <w:p>
@@ -716,6 +716,7 @@
           </w:tcPr>
           <w:p>
             <w:pPr>
+              <w:pageBreakBefore/>
               <w:ind w:left="0" w:hanging="2"/>
               <w:rPr>
                 <w:rFonts w:ascii="Arial" w:eastAsia="Arial" w:hAnsi="Arial" w:cs="Arial"/>
@@ -2897,6 +2898,13 @@
 <w:ftr xmlns:wpc="http://schemas.microsoft.com/office/word/2010/wordprocessingCanvas" xmlns:cx="http://schemas.microsoft.com/office/drawing/2014/chartex" xmlns:cx1="http://schemas.microsoft.com/office/drawing/2015/9/8/chartex" xmlns:cx2="http://schemas.microsoft.com/office/drawing/2015/10/21/chartex" xmlns:cx3="http://schemas.microsoft.com/office/drawing/2016/5/9/chartex" xmlns:cx4="http://schemas.microsoft.com/office/drawing/2016/5/10/chartex" xmlns:cx5="http://schemas.microsoft.com/office/drawing/2016/5/11/chartex" xmlns:cx6="http://schemas.microsoft.com/office/drawing/2016/5/12/chartex" xmlns:cx7="http://schemas.microsoft.com/office/drawing/2016/5/13/chartex" xmlns:cx8="http://schemas.microsoft.com/office/drawing/2016/5/14/chartex" xmlns:mc="http://schemas.openxmlformats.org/markup-compatibility/2006" xmlns:aink="http://schemas.microsoft.com/office/drawing/2016/ink" xmlns:am3d="http://schemas.microsoft.com/office/drawing/2017/model3d" xmlns:o="urn:schemas-microsoft-com:office:office" xmlns:oel="http://schemas.microsoft.com/office/2019/extlst" xmlns:r="http://schemas.openxmlformats.org/officeDocument/2006/relationships" xmlns:m="http://schemas.openxmlformats.org/officeDocument/2006/math" xmlns:v="urn:schemas-microsoft-com:vml" xmlns:wp14="http://schemas.microsoft.com/office/word/2010/wordprocessingDrawing" xmlns:wp="http://schemas.openxmlformats.org/drawingml/2006/wordprocessingDrawing" xmlns:w10="urn:schemas-microsoft-com:office:word" xmlns:w="http://schemas.openxmlformats.org/wordprocessingml/2006/main" xmlns:w14="http://schemas.microsoft.com/office/word/2010/wordml" xmlns:w15="http://schemas.microsoft.com/office/word/2012/wordml" xmlns:w16cex="http://schemas.microsoft.com/office/word/2018/wordml/cex" xmlns:w16cid="http://schemas.microsoft.com/office/word/2016/wordml/cid" xmlns:w16="http://schemas.microsoft.com/office/word/2018/wordml" xmlns:w16du="http://schemas.microsoft.com/office/word/2023/wordml/word16du" xmlns:w16sdtdh="http://schemas.microsoft.com/office/word/2020/wordml/sdtdatahash" xmlns:w16sdtfl="http://schemas.microsoft.com/office/word/2024/wordml/sdtformatlock" xmlns:w16se="http://schemas.microsoft.com/office/word/2015/wordml/symex" xmlns:wpg="http://schemas.microsoft.com/office/word/2010/wordprocessingGroup" xmlns:wpi="http://schemas.microsoft.com/office/word/2010/wordprocessingInk" xmlns:wne="http://schemas.microsoft.com/office/word/2006/wordml" xmlns:wps="http://schemas.microsoft.com/office/word/2010/wordprocessingShape" mc:Ignorable="w14 w15 w16se w16cid w16 w16cex w16sdtdh w16sdtfl w16du wp14">
   <w:p>
     <w:pPr>
+      <w:pBdr>
+        <w:top w:val="nil"/>
+        <w:left w:val="nil"/>
+        <w:bottom w:val="nil"/>
+        <w:right w:val="nil"/>
+        <w:between w:val="nil"/>
+      </w:pBdr>
       <w:tabs>
         <w:tab w:val="center" w:pos="4513"/>
         <w:tab w:val="right" w:pos="9026"/>
@@ -2915,6 +2923,13 @@
 <w:ftr xmlns:wpc="http://schemas.microsoft.com/office/word/2010/wordprocessingCanvas" xmlns:cx="http://schemas.microsoft.com/office/drawing/2014/chartex" xmlns:cx1="http://schemas.microsoft.com/office/drawing/2015/9/8/chartex" xmlns:cx2="http://schemas.microsoft.com/office/drawing/2015/10/21/chartex" xmlns:cx3="http://schemas.microsoft.com/office/drawing/2016/5/9/chartex" xmlns:cx4="http://schemas.microsoft.com/office/drawing/2016/5/10/chartex" xmlns:cx5="http://schemas.microsoft.com/office/drawing/2016/5/11/chartex" xmlns:cx6="http://schemas.microsoft.com/office/drawing/2016/5/12/chartex" xmlns:cx7="http://schemas.microsoft.com/office/drawing/2016/5/13/chartex" xmlns:cx8="http://schemas.microsoft.com/office/drawing/2016/5/14/chartex" xmlns:mc="http://schemas.openxmlformats.org/markup-compatibility/2006" xmlns:aink="http://schemas.microsoft.com/office/drawing/2016/ink" xmlns:am3d="http://schemas.microsoft.com/office/drawing/2017/model3d" xmlns:o="urn:schemas-microsoft-com:office:office" xmlns:oel="http://schemas.microsoft.com/office/2019/extlst" xmlns:r="http://schemas.openxmlformats.org/officeDocument/2006/relationships" xmlns:m="http://schemas.openxmlformats.org/officeDocument/2006/math" xmlns:v="urn:schemas-microsoft-com:vml" xmlns:wp14="http://schemas.microsoft.com/office/word/2010/wordprocessingDrawing" xmlns:wp="http://schemas.openxmlformats.org/drawingml/2006/wordprocessingDrawing" xmlns:w10="urn:schemas-microsoft-com:office:word" xmlns:w="http://schemas.openxmlformats.org/wordprocessingml/2006/main" xmlns:w14="http://schemas.microsoft.com/office/word/2010/wordml" xmlns:w15="http://schemas.microsoft.com/office/word/2012/wordml" xmlns:w16cex="http://schemas.microsoft.com/office/word/2018/wordml/cex" xmlns:w16cid="http://schemas.microsoft.com/office/word/2016/wordml/cid" xmlns:w16="http://schemas.microsoft.com/office/word/2018/wordml" xmlns:w16du="http://schemas.microsoft.com/office/word/2023/wordml/word16du" xmlns:w16sdtdh="http://schemas.microsoft.com/office/word/2020/wordml/sdtdatahash" xmlns:w16sdtfl="http://schemas.microsoft.com/office/word/2024/wordml/sdtformatlock" xmlns:w16se="http://schemas.microsoft.com/office/word/2015/wordml/symex" xmlns:wpg="http://schemas.microsoft.com/office/word/2010/wordprocessingGroup" xmlns:wpi="http://schemas.microsoft.com/office/word/2010/wordprocessingInk" xmlns:wne="http://schemas.microsoft.com/office/word/2006/wordml" xmlns:wps="http://schemas.microsoft.com/office/word/2010/wordprocessingShape" mc:Ignorable="w14 w15 w16se w16cid w16 w16cex w16sdtdh w16sdtfl w16du wp14">
   <w:p>
     <w:pPr>
+      <w:pBdr>
+        <w:top w:val="nil"/>
+        <w:left w:val="nil"/>
+        <w:bottom w:val="nil"/>
+        <w:right w:val="nil"/>
+        <w:between w:val="nil"/>
+      </w:pBdr>
       <w:tabs>
         <w:tab w:val="center" w:pos="4513"/>
         <w:tab w:val="right" w:pos="9026"/>
@@ -2933,6 +2948,13 @@
 <w:ftr xmlns:wpc="http://schemas.microsoft.com/office/word/2010/wordprocessingCanvas" xmlns:cx="http://schemas.microsoft.com/office/drawing/2014/chartex" xmlns:cx1="http://schemas.microsoft.com/office/drawing/2015/9/8/chartex" xmlns:cx2="http://schemas.microsoft.com/office/drawing/2015/10/21/chartex" xmlns:cx3="http://schemas.microsoft.com/office/drawing/2016/5/9/chartex" xmlns:cx4="http://schemas.microsoft.com/office/drawing/2016/5/10/chartex" xmlns:cx5="http://schemas.microsoft.com/office/drawing/2016/5/11/chartex" xmlns:cx6="http://schemas.microsoft.com/office/drawing/2016/5/12/chartex" xmlns:cx7="http://schemas.microsoft.com/office/drawing/2016/5/13/chartex" xmlns:cx8="http://schemas.microsoft.com/office/drawing/2016/5/14/chartex" xmlns:mc="http://schemas.openxmlformats.org/markup-compatibility/2006" xmlns:aink="http://schemas.microsoft.com/office/drawing/2016/ink" xmlns:am3d="http://schemas.microsoft.com/office/drawing/2017/model3d" xmlns:o="urn:schemas-microsoft-com:office:office" xmlns:oel="http://schemas.microsoft.com/office/2019/extlst" xmlns:r="http://schemas.openxmlformats.org/officeDocument/2006/relationships" xmlns:m="http://schemas.openxmlformats.org/officeDocument/2006/math" xmlns:v="urn:schemas-microsoft-com:vml" xmlns:wp14="http://schemas.microsoft.com/office/word/2010/wordprocessingDrawing" xmlns:wp="http://schemas.openxmlformats.org/drawingml/2006/wordprocessingDrawing" xmlns:w10="urn:schemas-microsoft-com:office:word" xmlns:w="http://schemas.openxmlformats.org/wordprocessingml/2006/main" xmlns:w14="http://schemas.microsoft.com/office/word/2010/wordml" xmlns:w15="http://schemas.microsoft.com/office/word/2012/wordml" xmlns:w16cex="http://schemas.microsoft.com/office/word/2018/wordml/cex" xmlns:w16cid="http://schemas.microsoft.com/office/word/2016/wordml/cid" xmlns:w16="http://schemas.microsoft.com/office/word/2018/wordml" xmlns:w16du="http://schemas.microsoft.com/office/word/2023/wordml/word16du" xmlns:w16sdtdh="http://schemas.microsoft.com/office/word/2020/wordml/sdtdatahash" xmlns:w16sdtfl="http://schemas.microsoft.com/office/word/2024/wordml/sdtformatlock" xmlns:w16se="http://schemas.microsoft.com/office/word/2015/wordml/symex" xmlns:wpg="http://schemas.microsoft.com/office/word/2010/wordprocessingGroup" xmlns:wpi="http://schemas.microsoft.com/office/word/2010/wordprocessingInk" xmlns:wne="http://schemas.microsoft.com/office/word/2006/wordml" xmlns:wps="http://schemas.microsoft.com/office/word/2010/wordprocessingShape" mc:Ignorable="w14 w15 w16se w16cid w16 w16cex w16sdtdh w16sdtfl w16du wp14">
   <w:p>
     <w:pPr>
+      <w:pBdr>
+        <w:top w:val="nil"/>
+        <w:left w:val="nil"/>
+        <w:bottom w:val="nil"/>
+        <w:right w:val="nil"/>
+        <w:between w:val="nil"/>
+      </w:pBdr>
       <w:tabs>
         <w:tab w:val="center" w:pos="4513"/>
         <w:tab w:val="right" w:pos="9026"/>
@@ -2978,6 +3000,13 @@
 <w:hdr xmlns:wpc="http://schemas.microsoft.com/office/word/2010/wordprocessingCanvas" xmlns:cx="http://schemas.microsoft.com/office/drawing/2014/chartex" xmlns:cx1="http://schemas.microsoft.com/office/drawing/2015/9/8/chartex" xmlns:cx2="http://schemas.microsoft.com/office/drawing/2015/10/21/chartex" xmlns:cx3="http://schemas.microsoft.com/office/drawing/2016/5/9/chartex" xmlns:cx4="http://schemas.microsoft.com/office/drawing/2016/5/10/chartex" xmlns:cx5="http://schemas.microsoft.com/office/drawing/2016/5/11/chartex" xmlns:cx6="http://schemas.microsoft.com/office/drawing/2016/5/12/chartex" xmlns:cx7="http://schemas.microsoft.com/office/drawing/2016/5/13/chartex" xmlns:cx8="http://schemas.microsoft.com/office/drawing/2016/5/14/chartex" xmlns:mc="http://schemas.openxmlformats.org/markup-compatibility/2006" xmlns:aink="http://schemas.microsoft.com/office/drawing/2016/ink" xmlns:am3d="http://schemas.microsoft.com/office/drawing/2017/model3d" xmlns:o="urn:schemas-microsoft-com:office:office" xmlns:oel="http://schemas.microsoft.com/office/2019/extlst" xmlns:r="http://schemas.openxmlformats.org/officeDocument/2006/relationships" xmlns:m="http://schemas.openxmlformats.org/officeDocument/2006/math" xmlns:v="urn:schemas-microsoft-com:vml" xmlns:wp14="http://schemas.microsoft.com/office/word/2010/wordprocessingDrawing" xmlns:wp="http://schemas.openxmlformats.org/drawingml/2006/wordprocessingDrawing" xmlns:w10="urn:schemas-microsoft-com:office:word" xmlns:w="http://schemas.openxmlformats.org/wordprocessingml/2006/main" xmlns:w14="http://schemas.microsoft.com/office/word/2010/wordml" xmlns:w15="http://schemas.microsoft.com/office/word/2012/wordml" xmlns:w16cex="http://schemas.microsoft.com/office/word/2018/wordml/cex" xmlns:w16cid="http://schemas.microsoft.com/office/word/2016/wordml/cid" xmlns:w16="http://schemas.microsoft.com/office/word/2018/wordml" xmlns:w16du="http://schemas.microsoft.com/office/word/2023/wordml/word16du" xmlns:w16sdtdh="http://schemas.microsoft.com/office/word/2020/wordml/sdtdatahash" xmlns:w16sdtfl="http://schemas.microsoft.com/office/word/2024/wordml/sdtformatlock" xmlns:w16se="http://schemas.microsoft.com/office/word/2015/wordml/symex" xmlns:wpg="http://schemas.microsoft.com/office/word/2010/wordprocessingGroup" xmlns:wpi="http://schemas.microsoft.com/office/word/2010/wordprocessingInk" xmlns:wne="http://schemas.microsoft.com/office/word/2006/wordml" xmlns:wps="http://schemas.microsoft.com/office/word/2010/wordprocessingShape" mc:Ignorable="w14 w15 w16se w16cid w16 w16cex w16sdtdh w16sdtfl w16du wp14">
   <w:p>
     <w:pPr>
+      <w:pBdr>
+        <w:top w:val="nil"/>
+        <w:left w:val="nil"/>
+        <w:bottom w:val="nil"/>
+        <w:right w:val="nil"/>
+        <w:between w:val="nil"/>
+      </w:pBdr>
       <w:tabs>
         <w:tab w:val="center" w:pos="4513"/>
         <w:tab w:val="right" w:pos="9026"/>
@@ -2996,6 +3025,13 @@
 <w:hdr xmlns:wpc="http://schemas.microsoft.com/office/word/2010/wordprocessingCanvas" xmlns:cx="http://schemas.microsoft.com/office/drawing/2014/chartex" xmlns:cx1="http://schemas.microsoft.com/office/drawing/2015/9/8/chartex" xmlns:cx2="http://schemas.microsoft.com/office/drawing/2015/10/21/chartex" xmlns:cx3="http://schemas.microsoft.com/office/drawing/2016/5/9/chartex" xmlns:cx4="http://schemas.microsoft.com/office/drawing/2016/5/10/chartex" xmlns:cx5="http://schemas.microsoft.com/office/drawing/2016/5/11/chartex" xmlns:cx6="http://schemas.microsoft.com/office/drawing/2016/5/12/chartex" xmlns:cx7="http://schemas.microsoft.com/office/drawing/2016/5/13/chartex" xmlns:cx8="http://schemas.microsoft.com/office/drawing/2016/5/14/chartex" xmlns:mc="http://schemas.openxmlformats.org/markup-compatibility/2006" xmlns:aink="http://schemas.microsoft.com/office/drawing/2016/ink" xmlns:am3d="http://schemas.microsoft.com/office/drawing/2017/model3d" xmlns:o="urn:schemas-microsoft-com:office:office" xmlns:oel="http://schemas.microsoft.com/office/2019/extlst" xmlns:r="http://schemas.openxmlformats.org/officeDocument/2006/relationships" xmlns:m="http://schemas.openxmlformats.org/officeDocument/2006/math" xmlns:v="urn:schemas-microsoft-com:vml" xmlns:wp14="http://schemas.microsoft.com/office/word/2010/wordprocessingDrawing" xmlns:wp="http://schemas.openxmlformats.org/drawingml/2006/wordprocessingDrawing" xmlns:w10="urn:schemas-microsoft-com:office:word" xmlns:w="http://schemas.openxmlformats.org/wordprocessingml/2006/main" xmlns:w14="http://schemas.microsoft.com/office/word/2010/wordml" xmlns:w15="http://schemas.microsoft.com/office/word/2012/wordml" xmlns:w16cex="http://schemas.microsoft.com/office/word/2018/wordml/cex" xmlns:w16cid="http://schemas.microsoft.com/office/word/2016/wordml/cid" xmlns:w16="http://schemas.microsoft.com/office/word/2018/wordml" xmlns:w16du="http://schemas.microsoft.com/office/word/2023/wordml/word16du" xmlns:w16sdtdh="http://schemas.microsoft.com/office/word/2020/wordml/sdtdatahash" xmlns:w16sdtfl="http://schemas.microsoft.com/office/word/2024/wordml/sdtformatlock" xmlns:w16se="http://schemas.microsoft.com/office/word/2015/wordml/symex" xmlns:wpg="http://schemas.microsoft.com/office/word/2010/wordprocessingGroup" xmlns:wpi="http://schemas.microsoft.com/office/word/2010/wordprocessingInk" xmlns:wne="http://schemas.microsoft.com/office/word/2006/wordml" xmlns:wps="http://schemas.microsoft.com/office/word/2010/wordprocessingShape" mc:Ignorable="w14 w15 w16se w16cid w16 w16cex w16sdtdh w16sdtfl w16du wp14">
   <w:p>
     <w:pPr>
+      <w:pBdr>
+        <w:top w:val="nil"/>
+        <w:left w:val="nil"/>
+        <w:bottom w:val="nil"/>
+        <w:right w:val="nil"/>
+        <w:between w:val="nil"/>
+      </w:pBdr>
       <w:tabs>
         <w:tab w:val="center" w:pos="4513"/>
         <w:tab w:val="right" w:pos="9026"/>
@@ -3014,6 +3050,13 @@
 <w:hdr xmlns:wpc="http://schemas.microsoft.com/office/word/2010/wordprocessingCanvas" xmlns:cx="http://schemas.microsoft.com/office/drawing/2014/chartex" xmlns:cx1="http://schemas.microsoft.com/office/drawing/2015/9/8/chartex" xmlns:cx2="http://schemas.microsoft.com/office/drawing/2015/10/21/chartex" xmlns:cx3="http://schemas.microsoft.com/office/drawing/2016/5/9/chartex" xmlns:cx4="http://schemas.microsoft.com/office/drawing/2016/5/10/chartex" xmlns:cx5="http://schemas.microsoft.com/office/drawing/2016/5/11/chartex" xmlns:cx6="http://schemas.microsoft.com/office/drawing/2016/5/12/chartex" xmlns:cx7="http://schemas.microsoft.com/office/drawing/2016/5/13/chartex" xmlns:cx8="http://schemas.microsoft.com/office/drawing/2016/5/14/chartex" xmlns:mc="http://schemas.openxmlformats.org/markup-compatibility/2006" xmlns:aink="http://schemas.microsoft.com/office/drawing/2016/ink" xmlns:am3d="http://schemas.microsoft.com/office/drawing/2017/model3d" xmlns:o="urn:schemas-microsoft-com:office:office" xmlns:oel="http://schemas.microsoft.com/office/2019/extlst" xmlns:r="http://schemas.openxmlformats.org/officeDocument/2006/relationships" xmlns:m="http://schemas.openxmlformats.org/officeDocument/2006/math" xmlns:v="urn:schemas-microsoft-com:vml" xmlns:wp14="http://schemas.microsoft.com/office/word/2010/wordprocessingDrawing" xmlns:wp="http://schemas.openxmlformats.org/drawingml/2006/wordprocessingDrawing" xmlns:w10="urn:schemas-microsoft-com:office:word" xmlns:w="http://schemas.openxmlformats.org/wordprocessingml/2006/main" xmlns:w14="http://schemas.microsoft.com/office/word/2010/wordml" xmlns:w15="http://schemas.microsoft.com/office/word/2012/wordml" xmlns:w16cex="http://schemas.microsoft.com/office/word/2018/wordml/cex" xmlns:w16cid="http://schemas.microsoft.com/office/word/2016/wordml/cid" xmlns:w16="http://schemas.microsoft.com/office/word/2018/wordml" xmlns:w16du="http://schemas.microsoft.com/office/word/2023/wordml/word16du" xmlns:w16sdtdh="http://schemas.microsoft.com/office/word/2020/wordml/sdtdatahash" xmlns:w16sdtfl="http://schemas.microsoft.com/office/word/2024/wordml/sdtformatlock" xmlns:w16se="http://schemas.microsoft.com/office/word/2015/wordml/symex" xmlns:wpg="http://schemas.microsoft.com/office/word/2010/wordprocessingGroup" xmlns:wpi="http://schemas.microsoft.com/office/word/2010/wordprocessingInk" xmlns:wne="http://schemas.microsoft.com/office/word/2006/wordml" xmlns:wps="http://schemas.microsoft.com/office/word/2010/wordprocessingShape" mc:Ignorable="w14 w15 w16se w16cid w16 w16cex w16sdtdh w16sdtfl w16du wp14">
   <w:p>
     <w:pPr>
+      <w:pBdr>
+        <w:top w:val="nil"/>
+        <w:left w:val="nil"/>
+        <w:bottom w:val="nil"/>
+        <w:right w:val="nil"/>
+        <w:between w:val="nil"/>
+      </w:pBdr>
       <w:tabs>
         <w:tab w:val="center" w:pos="4513"/>
         <w:tab w:val="right" w:pos="9026"/>

</xml_diff>

<commit_message>
vault backup: 2026-10-18 09:49:25
</commit_message>
<xml_diff>
--- a/Visa/801 - Permanent Residency/Prepared Documents/Scott Relationship Statement 801 First Review Draft - WaKr-2631-801-3.docx
+++ b/Visa/801 - Permanent Residency/Prepared Documents/Scott Relationship Statement 801 First Review Draft - WaKr-2631-801-3.docx
@@ -676,6 +676,9 @@
               </w:rPr>
               <w:t>I understand that a person who intentionally makes a false statement in a statutory declaration is guilty of an offence under section 11 of the Statutory Declarations Act 1959, and I believe that the statements in this declaration are true in every particular.</w:t>
             </w:r>
+            <w:r>
+              <w:br w:type="page"/>
+            </w:r>
           </w:p>
         </w:tc>
       </w:tr>
@@ -716,7 +719,6 @@
           </w:tcPr>
           <w:p>
             <w:pPr>
-              <w:pageBreakBefore/>
               <w:ind w:left="0" w:hanging="2"/>
               <w:rPr>
                 <w:rFonts w:ascii="Arial" w:eastAsia="Arial" w:hAnsi="Arial" w:cs="Arial"/>

</xml_diff>